<commit_message>
Versión 2.59: firma electrónica del usuario en los recibos y recibo con el formato de los Word
Co-Authored-By: Claude Sonnet 5.5 <noreply@anthropic.com>
Claude-Session: https://claude.ai/code/session_019U8vAjFe3j5iDuSiRSVZPb
</commit_message>
<xml_diff>
--- a/juanmaapp/public/recibo-base.docx
+++ b/juanmaapp/public/recibo-base.docx
@@ -17,6 +17,7 @@
           <w:color w:val="1F3864"/>
           <w:sz w:val="28"/>
           <w:szCs w:val="28"/>
+          <w:u w:val="single"/>
         </w:rPr>
         <w:t xml:space="preserve">RECIBO DE CAJA No. {{recibo.numero}}</w:t>
       </w:r>
@@ -33,8 +34,8 @@
           <w:b/>
           <w:bCs/>
           <w:color w:val="1F3864"/>
-          <w:sz w:val="22"/>
-          <w:szCs w:val="22"/>
+          <w:sz w:val="24"/>
+          <w:szCs w:val="24"/>
         </w:rPr>
         <w:t xml:space="preserve">{{#recibo.estado}}{{recibo.estado}}{{/recibo.estado}}</w:t>
       </w:r>
@@ -51,8 +52,8 @@
           <w:b/>
           <w:bCs/>
           <w:color w:val="1F3864"/>
-          <w:sz w:val="22"/>
-          <w:szCs w:val="22"/>
+          <w:sz w:val="24"/>
+          <w:szCs w:val="24"/>
         </w:rPr>
         <w:t xml:space="preserve">Fecha de pago: </w:t>
       </w:r>
@@ -60,8 +61,8 @@
         <w:rPr>
           <w:rFonts w:ascii="Century Gothic" w:hAnsi="Century Gothic"/>
           <w:color w:val="1F3864"/>
-          <w:sz w:val="22"/>
-          <w:szCs w:val="22"/>
+          <w:sz w:val="24"/>
+          <w:szCs w:val="24"/>
         </w:rPr>
         <w:t xml:space="preserve">{{recibo.fecha}}</w:t>
       </w:r>
@@ -78,8 +79,8 @@
           <w:b/>
           <w:bCs/>
           <w:color w:val="1F3864"/>
-          <w:sz w:val="22"/>
-          <w:szCs w:val="22"/>
+          <w:sz w:val="24"/>
+          <w:szCs w:val="24"/>
         </w:rPr>
         <w:t xml:space="preserve">Recibimos de: </w:t>
       </w:r>
@@ -87,8 +88,8 @@
         <w:rPr>
           <w:rFonts w:ascii="Century Gothic" w:hAnsi="Century Gothic"/>
           <w:color w:val="1F3864"/>
-          <w:sz w:val="22"/>
-          <w:szCs w:val="22"/>
+          <w:sz w:val="24"/>
+          <w:szCs w:val="24"/>
         </w:rPr>
         <w:t xml:space="preserve">{{recibo.cliente}}</w:t>
       </w:r>
@@ -105,8 +106,8 @@
           <w:b/>
           <w:bCs/>
           <w:color w:val="1F3864"/>
-          <w:sz w:val="22"/>
-          <w:szCs w:val="22"/>
+          <w:sz w:val="24"/>
+          <w:szCs w:val="24"/>
         </w:rPr>
         <w:t xml:space="preserve">Identificación: </w:t>
       </w:r>
@@ -114,8 +115,8 @@
         <w:rPr>
           <w:rFonts w:ascii="Century Gothic" w:hAnsi="Century Gothic"/>
           <w:color w:val="1F3864"/>
-          <w:sz w:val="22"/>
-          <w:szCs w:val="22"/>
+          <w:sz w:val="24"/>
+          <w:szCs w:val="24"/>
         </w:rPr>
         <w:t xml:space="preserve">{{recibo.documento}}</w:t>
       </w:r>
@@ -132,8 +133,8 @@
           <w:b/>
           <w:bCs/>
           <w:color w:val="1F3864"/>
-          <w:sz w:val="22"/>
-          <w:szCs w:val="22"/>
+          <w:sz w:val="24"/>
+          <w:szCs w:val="24"/>
         </w:rPr>
         <w:t xml:space="preserve">La suma de: </w:t>
       </w:r>
@@ -141,8 +142,8 @@
         <w:rPr>
           <w:rFonts w:ascii="Century Gothic" w:hAnsi="Century Gothic"/>
           <w:color w:val="1F3864"/>
-          <w:sz w:val="22"/>
-          <w:szCs w:val="22"/>
+          <w:sz w:val="24"/>
+          <w:szCs w:val="24"/>
         </w:rPr>
         <w:t xml:space="preserve">{{recibo.valor}}</w:t>
       </w:r>
@@ -159,8 +160,8 @@
           <w:b/>
           <w:bCs/>
           <w:color w:val="1F3864"/>
-          <w:sz w:val="22"/>
-          <w:szCs w:val="22"/>
+          <w:sz w:val="24"/>
+          <w:szCs w:val="24"/>
         </w:rPr>
         <w:t xml:space="preserve">En letras: </w:t>
       </w:r>
@@ -168,8 +169,8 @@
         <w:rPr>
           <w:rFonts w:ascii="Century Gothic" w:hAnsi="Century Gothic"/>
           <w:color w:val="1F3864"/>
-          <w:sz w:val="22"/>
-          <w:szCs w:val="22"/>
+          <w:sz w:val="24"/>
+          <w:szCs w:val="24"/>
         </w:rPr>
         <w:t xml:space="preserve">{{recibo.valor_letras}}</w:t>
       </w:r>
@@ -186,8 +187,8 @@
           <w:b/>
           <w:bCs/>
           <w:color w:val="1F3864"/>
-          <w:sz w:val="22"/>
-          <w:szCs w:val="22"/>
+          <w:sz w:val="24"/>
+          <w:szCs w:val="24"/>
         </w:rPr>
         <w:t xml:space="preserve">Por concepto de: </w:t>
       </w:r>
@@ -195,8 +196,8 @@
         <w:rPr>
           <w:rFonts w:ascii="Century Gothic" w:hAnsi="Century Gothic"/>
           <w:color w:val="1F3864"/>
-          <w:sz w:val="22"/>
-          <w:szCs w:val="22"/>
+          <w:sz w:val="24"/>
+          <w:szCs w:val="24"/>
         </w:rPr>
         <w:t xml:space="preserve">{{recibo.concepto}}</w:t>
       </w:r>
@@ -216,8 +217,8 @@
           <w:b/>
           <w:bCs/>
           <w:color w:val="1F3864"/>
-          <w:sz w:val="22"/>
-          <w:szCs w:val="22"/>
+          <w:sz w:val="24"/>
+          <w:szCs w:val="24"/>
         </w:rPr>
         <w:t xml:space="preserve">Expediente: </w:t>
       </w:r>
@@ -225,8 +226,8 @@
         <w:rPr>
           <w:rFonts w:ascii="Century Gothic" w:hAnsi="Century Gothic"/>
           <w:color w:val="1F3864"/>
-          <w:sz w:val="22"/>
-          <w:szCs w:val="22"/>
+          <w:sz w:val="24"/>
+          <w:szCs w:val="24"/>
         </w:rPr>
         <w:t xml:space="preserve">{{recibo.expediente}}</w:t>
       </w:r>
@@ -246,8 +247,8 @@
           <w:b/>
           <w:bCs/>
           <w:color w:val="1F3864"/>
-          <w:sz w:val="22"/>
-          <w:szCs w:val="22"/>
+          <w:sz w:val="24"/>
+          <w:szCs w:val="24"/>
         </w:rPr>
         <w:t xml:space="preserve">Medio de pago: </w:t>
       </w:r>
@@ -255,8 +256,8 @@
         <w:rPr>
           <w:rFonts w:ascii="Century Gothic" w:hAnsi="Century Gothic"/>
           <w:color w:val="1F3864"/>
-          <w:sz w:val="22"/>
-          <w:szCs w:val="22"/>
+          <w:sz w:val="24"/>
+          <w:szCs w:val="24"/>
         </w:rPr>
         <w:t xml:space="preserve">{{recibo.medio}}</w:t>
       </w:r>
@@ -276,8 +277,8 @@
           <w:b/>
           <w:bCs/>
           <w:color w:val="1F3864"/>
-          <w:sz w:val="22"/>
-          <w:szCs w:val="22"/>
+          <w:sz w:val="24"/>
+          <w:szCs w:val="24"/>
         </w:rPr>
         <w:t xml:space="preserve">Referencia: </w:t>
       </w:r>
@@ -285,8 +286,8 @@
         <w:rPr>
           <w:rFonts w:ascii="Century Gothic" w:hAnsi="Century Gothic"/>
           <w:color w:val="1F3864"/>
-          <w:sz w:val="22"/>
-          <w:szCs w:val="22"/>
+          <w:sz w:val="24"/>
+          <w:szCs w:val="24"/>
         </w:rPr>
         <w:t xml:space="preserve">{{recibo.referencia}}</w:t>
       </w:r>
@@ -309,8 +310,8 @@
           <w:b/>
           <w:bCs/>
           <w:color w:val="1F3864"/>
-          <w:sz w:val="22"/>
-          <w:szCs w:val="22"/>
+          <w:sz w:val="24"/>
+          <w:szCs w:val="24"/>
         </w:rPr>
         <w:t xml:space="preserve">Observaciones: </w:t>
       </w:r>
@@ -318,8 +319,8 @@
         <w:rPr>
           <w:rFonts w:ascii="Century Gothic" w:hAnsi="Century Gothic"/>
           <w:color w:val="1F3864"/>
-          <w:sz w:val="22"/>
-          <w:szCs w:val="22"/>
+          <w:sz w:val="24"/>
+          <w:szCs w:val="24"/>
         </w:rPr>
         <w:t xml:space="preserve">{{recibo.notas}}</w:t>
       </w:r>
@@ -339,8 +340,8 @@
           <w:b/>
           <w:bCs/>
           <w:color w:val="1F3864"/>
-          <w:sz w:val="22"/>
-          <w:szCs w:val="22"/>
+          <w:sz w:val="24"/>
+          <w:szCs w:val="24"/>
         </w:rPr>
         <w:t xml:space="preserve">Saldo pendiente a la fecha de emisión: </w:t>
       </w:r>
@@ -348,8 +349,8 @@
         <w:rPr>
           <w:rFonts w:ascii="Century Gothic" w:hAnsi="Century Gothic"/>
           <w:color w:val="1F3864"/>
-          <w:sz w:val="22"/>
-          <w:szCs w:val="22"/>
+          <w:sz w:val="24"/>
+          <w:szCs w:val="24"/>
         </w:rPr>
         <w:t xml:space="preserve">{{recibo.saldo}}</w:t>
       </w:r>
@@ -364,8 +365,8 @@
         <w:rPr>
           <w:rFonts w:ascii="Century Gothic" w:hAnsi="Century Gothic"/>
           <w:color w:val="1F3864"/>
-          <w:sz w:val="22"/>
-          <w:szCs w:val="22"/>
+          <w:sz w:val="24"/>
+          <w:szCs w:val="24"/>
         </w:rPr>
         <w:t xml:space="preserve"/>
       </w:r>
@@ -381,8 +382,8 @@
         <w:rPr>
           <w:rFonts w:ascii="Century Gothic" w:hAnsi="Century Gothic"/>
           <w:color w:val="1F3864"/>
-          <w:sz w:val="22"/>
-          <w:szCs w:val="22"/>
+          <w:sz w:val="24"/>
+          <w:szCs w:val="24"/>
         </w:rPr>
         <w:t xml:space="preserve">______________________________</w:t>
       </w:r>
@@ -400,8 +401,8 @@
           <w:b/>
           <w:bCs/>
           <w:color w:val="1F3864"/>
-          <w:sz w:val="22"/>
-          <w:szCs w:val="22"/>
+          <w:sz w:val="24"/>
+          <w:szCs w:val="24"/>
         </w:rPr>
         <w:t xml:space="preserve">{{firma.nombre}}</w:t>
       </w:r>
@@ -417,8 +418,8 @@
         <w:rPr>
           <w:rFonts w:ascii="Century Gothic" w:hAnsi="Century Gothic"/>
           <w:color w:val="1F3864"/>
-          <w:sz w:val="22"/>
-          <w:szCs w:val="22"/>
+          <w:sz w:val="24"/>
+          <w:szCs w:val="24"/>
         </w:rPr>
         <w:t xml:space="preserve">C.C. No. {{firma.cedula|puntos}}</w:t>
       </w:r>
@@ -437,8 +438,8 @@
         <w:rPr>
           <w:rFonts w:ascii="Century Gothic" w:hAnsi="Century Gothic"/>
           <w:color w:val="1F3864"/>
-          <w:sz w:val="22"/>
-          <w:szCs w:val="22"/>
+          <w:sz w:val="24"/>
+          <w:szCs w:val="24"/>
         </w:rPr>
         <w:t xml:space="preserve">T.P. No. {{firma.tarjeta}} del Consejo Superior de la Judicatura</w:t>
       </w:r>

</xml_diff>

<commit_message>
Versión 2.2.3: membrete, pie, numeración de página y marca de agua en todos los PDF y Word que genera la App
Co-Authored-By: Claude Sonnet 5.5 <noreply@anthropic.com>
Claude-Session: https://claude.ai/code/session_018NctcCo68KjpMsUcXQk7bM
</commit_message>
<xml_diff>
--- a/juanmaapp/public/recibo-base.docx
+++ b/juanmaapp/public/recibo-base.docx
@@ -448,11 +448,11 @@
       </w:r>
     </w:p>
     <w:sectPr>
-      <w:headerReference w:type="even" r:id="rId9"/>
-      <w:headerReference w:type="default" r:id="rId10"/>
-      <w:footerReference w:type="default" r:id="rId11"/>
-      <w:headerReference w:type="first" r:id="rId12"/>
-      <w:footerReference w:type="first" r:id="rId13"/>
+      <w:headerReference w:type="even" r:id="rId8"/>
+      <w:headerReference w:type="default" r:id="rId9"/>
+      <w:footerReference w:type="default" r:id="rId10"/>
+      <w:headerReference w:type="first" r:id="rId11"/>
+      <w:footerReference w:type="first" r:id="rId12"/>
       <w:pgSz w:w="12240" w:h="15840" w:code="1"/>
       <w:pgMar w:top="1701" w:right="1701" w:bottom="1701" w:left="1985" w:header="709" w:footer="709" w:gutter="0"/>
       <w:pgBorders w:offsetFrom="page">
@@ -843,6 +843,121 @@
       </w:rPr>
     </w:pPr>
   </w:p>
+  <w:p>
+    <w:pPr>
+      <w:pStyle w:val="Piedepgina"/>
+      <w:spacing w:before="60" w:after="0"/>
+      <w:jc w:val="right"/>
+    </w:pPr>
+    <w:r>
+      <w:rPr>
+        <w:rFonts w:ascii="Century Gothic" w:hAnsi="Century Gothic"/>
+        <w:color w:val="1F3864"/>
+        <w:sz w:val="16"/>
+        <w:szCs w:val="16"/>
+      </w:rPr>
+      <w:t xml:space="preserve">Página </w:t>
+    </w:r>
+    <w:r>
+      <w:rPr>
+        <w:rFonts w:ascii="Century Gothic" w:hAnsi="Century Gothic"/>
+        <w:color w:val="1F3864"/>
+        <w:sz w:val="16"/>
+        <w:szCs w:val="16"/>
+      </w:rPr>
+      <w:fldChar w:fldCharType="begin"/>
+    </w:r>
+    <w:r>
+      <w:rPr>
+        <w:rFonts w:ascii="Century Gothic" w:hAnsi="Century Gothic"/>
+        <w:color w:val="1F3864"/>
+        <w:sz w:val="16"/>
+        <w:szCs w:val="16"/>
+      </w:rPr>
+      <w:instrText xml:space="preserve"> PAGE </w:instrText>
+    </w:r>
+    <w:r>
+      <w:rPr>
+        <w:rFonts w:ascii="Century Gothic" w:hAnsi="Century Gothic"/>
+        <w:color w:val="1F3864"/>
+        <w:sz w:val="16"/>
+        <w:szCs w:val="16"/>
+      </w:rPr>
+      <w:fldChar w:fldCharType="separate"/>
+    </w:r>
+    <w:r>
+      <w:rPr>
+        <w:rFonts w:ascii="Century Gothic" w:hAnsi="Century Gothic"/>
+        <w:color w:val="1F3864"/>
+        <w:sz w:val="16"/>
+        <w:szCs w:val="16"/>
+      </w:rPr>
+      <w:t>1</w:t>
+    </w:r>
+    <w:r>
+      <w:rPr>
+        <w:rFonts w:ascii="Century Gothic" w:hAnsi="Century Gothic"/>
+        <w:color w:val="1F3864"/>
+        <w:sz w:val="16"/>
+        <w:szCs w:val="16"/>
+      </w:rPr>
+      <w:fldChar w:fldCharType="end"/>
+    </w:r>
+    <w:r>
+      <w:rPr>
+        <w:rFonts w:ascii="Century Gothic" w:hAnsi="Century Gothic"/>
+        <w:color w:val="1F3864"/>
+        <w:sz w:val="16"/>
+        <w:szCs w:val="16"/>
+      </w:rPr>
+      <w:t xml:space="preserve"> de </w:t>
+    </w:r>
+    <w:r>
+      <w:rPr>
+        <w:rFonts w:ascii="Century Gothic" w:hAnsi="Century Gothic"/>
+        <w:color w:val="1F3864"/>
+        <w:sz w:val="16"/>
+        <w:szCs w:val="16"/>
+      </w:rPr>
+      <w:fldChar w:fldCharType="begin"/>
+    </w:r>
+    <w:r>
+      <w:rPr>
+        <w:rFonts w:ascii="Century Gothic" w:hAnsi="Century Gothic"/>
+        <w:color w:val="1F3864"/>
+        <w:sz w:val="16"/>
+        <w:szCs w:val="16"/>
+      </w:rPr>
+      <w:instrText xml:space="preserve"> NUMPAGES </w:instrText>
+    </w:r>
+    <w:r>
+      <w:rPr>
+        <w:rFonts w:ascii="Century Gothic" w:hAnsi="Century Gothic"/>
+        <w:color w:val="1F3864"/>
+        <w:sz w:val="16"/>
+        <w:szCs w:val="16"/>
+      </w:rPr>
+      <w:fldChar w:fldCharType="separate"/>
+    </w:r>
+    <w:r>
+      <w:rPr>
+        <w:rFonts w:ascii="Century Gothic" w:hAnsi="Century Gothic"/>
+        <w:color w:val="1F3864"/>
+        <w:sz w:val="16"/>
+        <w:szCs w:val="16"/>
+      </w:rPr>
+      <w:t>1</w:t>
+    </w:r>
+    <w:r>
+      <w:rPr>
+        <w:rFonts w:ascii="Century Gothic" w:hAnsi="Century Gothic"/>
+        <w:color w:val="1F3864"/>
+        <w:sz w:val="16"/>
+        <w:szCs w:val="16"/>
+      </w:rPr>
+      <w:fldChar w:fldCharType="end"/>
+    </w:r>
+  </w:p>
 </w:ftr>
 </file>
 
@@ -1228,6 +1343,121 @@
       </w:rPr>
     </w:pPr>
   </w:p>
+  <w:p>
+    <w:pPr>
+      <w:pStyle w:val="Piedepgina"/>
+      <w:spacing w:before="60" w:after="0"/>
+      <w:jc w:val="right"/>
+    </w:pPr>
+    <w:r>
+      <w:rPr>
+        <w:rFonts w:ascii="Century Gothic" w:hAnsi="Century Gothic"/>
+        <w:color w:val="1F3864"/>
+        <w:sz w:val="16"/>
+        <w:szCs w:val="16"/>
+      </w:rPr>
+      <w:t xml:space="preserve">Página </w:t>
+    </w:r>
+    <w:r>
+      <w:rPr>
+        <w:rFonts w:ascii="Century Gothic" w:hAnsi="Century Gothic"/>
+        <w:color w:val="1F3864"/>
+        <w:sz w:val="16"/>
+        <w:szCs w:val="16"/>
+      </w:rPr>
+      <w:fldChar w:fldCharType="begin"/>
+    </w:r>
+    <w:r>
+      <w:rPr>
+        <w:rFonts w:ascii="Century Gothic" w:hAnsi="Century Gothic"/>
+        <w:color w:val="1F3864"/>
+        <w:sz w:val="16"/>
+        <w:szCs w:val="16"/>
+      </w:rPr>
+      <w:instrText xml:space="preserve"> PAGE </w:instrText>
+    </w:r>
+    <w:r>
+      <w:rPr>
+        <w:rFonts w:ascii="Century Gothic" w:hAnsi="Century Gothic"/>
+        <w:color w:val="1F3864"/>
+        <w:sz w:val="16"/>
+        <w:szCs w:val="16"/>
+      </w:rPr>
+      <w:fldChar w:fldCharType="separate"/>
+    </w:r>
+    <w:r>
+      <w:rPr>
+        <w:rFonts w:ascii="Century Gothic" w:hAnsi="Century Gothic"/>
+        <w:color w:val="1F3864"/>
+        <w:sz w:val="16"/>
+        <w:szCs w:val="16"/>
+      </w:rPr>
+      <w:t>1</w:t>
+    </w:r>
+    <w:r>
+      <w:rPr>
+        <w:rFonts w:ascii="Century Gothic" w:hAnsi="Century Gothic"/>
+        <w:color w:val="1F3864"/>
+        <w:sz w:val="16"/>
+        <w:szCs w:val="16"/>
+      </w:rPr>
+      <w:fldChar w:fldCharType="end"/>
+    </w:r>
+    <w:r>
+      <w:rPr>
+        <w:rFonts w:ascii="Century Gothic" w:hAnsi="Century Gothic"/>
+        <w:color w:val="1F3864"/>
+        <w:sz w:val="16"/>
+        <w:szCs w:val="16"/>
+      </w:rPr>
+      <w:t xml:space="preserve"> de </w:t>
+    </w:r>
+    <w:r>
+      <w:rPr>
+        <w:rFonts w:ascii="Century Gothic" w:hAnsi="Century Gothic"/>
+        <w:color w:val="1F3864"/>
+        <w:sz w:val="16"/>
+        <w:szCs w:val="16"/>
+      </w:rPr>
+      <w:fldChar w:fldCharType="begin"/>
+    </w:r>
+    <w:r>
+      <w:rPr>
+        <w:rFonts w:ascii="Century Gothic" w:hAnsi="Century Gothic"/>
+        <w:color w:val="1F3864"/>
+        <w:sz w:val="16"/>
+        <w:szCs w:val="16"/>
+      </w:rPr>
+      <w:instrText xml:space="preserve"> NUMPAGES </w:instrText>
+    </w:r>
+    <w:r>
+      <w:rPr>
+        <w:rFonts w:ascii="Century Gothic" w:hAnsi="Century Gothic"/>
+        <w:color w:val="1F3864"/>
+        <w:sz w:val="16"/>
+        <w:szCs w:val="16"/>
+      </w:rPr>
+      <w:fldChar w:fldCharType="separate"/>
+    </w:r>
+    <w:r>
+      <w:rPr>
+        <w:rFonts w:ascii="Century Gothic" w:hAnsi="Century Gothic"/>
+        <w:color w:val="1F3864"/>
+        <w:sz w:val="16"/>
+        <w:szCs w:val="16"/>
+      </w:rPr>
+      <w:t>1</w:t>
+    </w:r>
+    <w:r>
+      <w:rPr>
+        <w:rFonts w:ascii="Century Gothic" w:hAnsi="Century Gothic"/>
+        <w:color w:val="1F3864"/>
+        <w:sz w:val="16"/>
+        <w:szCs w:val="16"/>
+      </w:rPr>
+      <w:fldChar w:fldCharType="end"/>
+    </w:r>
+  </w:p>
 </w:ftr>
 </file>
 
@@ -1262,6 +1492,58 @@
   <w:p>
     <w:pPr>
       <w:pStyle w:val="Encabezado"/>
+      <w:spacing w:after="0"/>
+    </w:pPr>
+    <w:r>
+      <w:rPr>
+        <w:noProof/>
+      </w:rPr>
+      <w:drawing>
+        <wp:anchor xmlns:wp="http://schemas.openxmlformats.org/drawingml/2006/wordprocessingDrawing" distT="0" distB="0" distL="0" distR="0" simplePos="0" relativeHeight="1" behindDoc="1" locked="0" layoutInCell="1" allowOverlap="1">
+          <wp:simplePos x="0" y="0"/>
+          <wp:positionH relativeFrom="page">
+            <wp:align>center</wp:align>
+          </wp:positionH>
+          <wp:positionV relativeFrom="page">
+            <wp:align>center</wp:align>
+          </wp:positionV>
+          <wp:extent cx="4500000" cy="2085577"/>
+          <wp:effectExtent l="0" t="0" r="0" b="0"/>
+          <wp:wrapNone/>
+          <wp:docPr id="9101" name="Marca de agua Tecjuridicos"/>
+          <wp:cNvGraphicFramePr/>
+          <a:graphic xmlns:a="http://schemas.openxmlformats.org/drawingml/2006/main">
+            <a:graphicData uri="http://schemas.openxmlformats.org/drawingml/2006/picture">
+              <pic:pic xmlns:pic="http://schemas.openxmlformats.org/drawingml/2006/picture">
+                <pic:nvPicPr>
+                  <pic:cNvPr id="9101" name="marca-de-agua.png"/>
+                  <pic:cNvPicPr/>
+                </pic:nvPicPr>
+                <pic:blipFill>
+                  <a:blip r:embed="rIdMarca"/>
+                  <a:stretch>
+                    <a:fillRect/>
+                  </a:stretch>
+                </pic:blipFill>
+                <pic:spPr>
+                  <a:xfrm>
+                    <a:off x="0" y="0"/>
+                    <a:ext cx="4500000" cy="2085577"/>
+                  </a:xfrm>
+                  <a:prstGeom prst="rect">
+                    <a:avLst/>
+                  </a:prstGeom>
+                </pic:spPr>
+              </pic:pic>
+            </a:graphicData>
+          </a:graphic>
+        </wp:anchor>
+      </w:drawing>
+    </w:r>
+  </w:p>
+  <w:p>
+    <w:pPr>
+      <w:pStyle w:val="Encabezado"/>
       <w:framePr w:wrap="around" w:vAnchor="text" w:hAnchor="margin" w:xAlign="center" w:y="1"/>
       <w:rPr>
         <w:rStyle w:val="Nmerodepgina"/>
@@ -1309,6 +1591,58 @@
 
 <file path=word/header2.xml><?xml version="1.0" encoding="utf-8"?>
 <w:hdr xmlns:wpc="http://schemas.microsoft.com/office/word/2010/wordprocessingCanvas" xmlns:cx="http://schemas.microsoft.com/office/drawing/2014/chartex" xmlns:cx1="http://schemas.microsoft.com/office/drawing/2015/9/8/chartex" xmlns:cx2="http://schemas.microsoft.com/office/drawing/2015/10/21/chartex" xmlns:cx3="http://schemas.microsoft.com/office/drawing/2016/5/9/chartex" xmlns:cx4="http://schemas.microsoft.com/office/drawing/2016/5/10/chartex" xmlns:cx5="http://schemas.microsoft.com/office/drawing/2016/5/11/chartex" xmlns:cx6="http://schemas.microsoft.com/office/drawing/2016/5/12/chartex" xmlns:cx7="http://schemas.microsoft.com/office/drawing/2016/5/13/chartex" xmlns:cx8="http://schemas.microsoft.com/office/drawing/2016/5/14/chartex" xmlns:mc="http://schemas.openxmlformats.org/markup-compatibility/2006" xmlns:aink="http://schemas.microsoft.com/office/drawing/2016/ink" xmlns:am3d="http://schemas.microsoft.com/office/drawing/2017/model3d" xmlns:o="urn:schemas-microsoft-com:office:office" xmlns:oel="http://schemas.microsoft.com/office/2019/extlst" xmlns:r="http://schemas.openxmlformats.org/officeDocument/2006/relationships" xmlns:m="http://schemas.openxmlformats.org/officeDocument/2006/math" xmlns:v="urn:schemas-microsoft-com:vml" xmlns:wp14="http://schemas.microsoft.com/office/word/2010/wordprocessingDrawing" xmlns:wp="http://schemas.openxmlformats.org/drawingml/2006/wordprocessingDrawing" xmlns:w10="urn:schemas-microsoft-com:office:word" xmlns:w="http://schemas.openxmlformats.org/wordprocessingml/2006/main" xmlns:w14="http://schemas.microsoft.com/office/word/2010/wordml" xmlns:w15="http://schemas.microsoft.com/office/word/2012/wordml" xmlns:w16cex="http://schemas.microsoft.com/office/word/2018/wordml/cex" xmlns:w16cid="http://schemas.microsoft.com/office/word/2016/wordml/cid" xmlns:w16="http://schemas.microsoft.com/office/word/2018/wordml" xmlns:w16du="http://schemas.microsoft.com/office/word/2023/wordml/word16du" xmlns:w16sdtdh="http://schemas.microsoft.com/office/word/2020/wordml/sdtdatahash" xmlns:w16sdtfl="http://schemas.microsoft.com/office/word/2024/wordml/sdtformatlock" xmlns:w16se="http://schemas.microsoft.com/office/word/2015/wordml/symex" xmlns:wpg="http://schemas.microsoft.com/office/word/2010/wordprocessingGroup" xmlns:wpi="http://schemas.microsoft.com/office/word/2010/wordprocessingInk" xmlns:wne="http://schemas.microsoft.com/office/word/2006/wordml" xmlns:wps="http://schemas.microsoft.com/office/word/2010/wordprocessingShape" mc:Ignorable="w14 w15 w16se w16cid w16 w16cex w16sdtdh w16sdtfl w16du wp14">
+  <w:p>
+    <w:pPr>
+      <w:pStyle w:val="Encabezado"/>
+      <w:spacing w:after="0"/>
+    </w:pPr>
+    <w:r>
+      <w:rPr>
+        <w:noProof/>
+      </w:rPr>
+      <w:drawing>
+        <wp:anchor xmlns:wp="http://schemas.openxmlformats.org/drawingml/2006/wordprocessingDrawing" distT="0" distB="0" distL="0" distR="0" simplePos="0" relativeHeight="1" behindDoc="1" locked="0" layoutInCell="1" allowOverlap="1">
+          <wp:simplePos x="0" y="0"/>
+          <wp:positionH relativeFrom="page">
+            <wp:align>center</wp:align>
+          </wp:positionH>
+          <wp:positionV relativeFrom="page">
+            <wp:align>center</wp:align>
+          </wp:positionV>
+          <wp:extent cx="4500000" cy="2085577"/>
+          <wp:effectExtent l="0" t="0" r="0" b="0"/>
+          <wp:wrapNone/>
+          <wp:docPr id="9101" name="Marca de agua Tecjuridicos"/>
+          <wp:cNvGraphicFramePr/>
+          <a:graphic xmlns:a="http://schemas.openxmlformats.org/drawingml/2006/main">
+            <a:graphicData uri="http://schemas.openxmlformats.org/drawingml/2006/picture">
+              <pic:pic xmlns:pic="http://schemas.openxmlformats.org/drawingml/2006/picture">
+                <pic:nvPicPr>
+                  <pic:cNvPr id="9101" name="marca-de-agua.png"/>
+                  <pic:cNvPicPr/>
+                </pic:nvPicPr>
+                <pic:blipFill>
+                  <a:blip r:embed="rIdMarca"/>
+                  <a:stretch>
+                    <a:fillRect/>
+                  </a:stretch>
+                </pic:blipFill>
+                <pic:spPr>
+                  <a:xfrm>
+                    <a:off x="0" y="0"/>
+                    <a:ext cx="4500000" cy="2085577"/>
+                  </a:xfrm>
+                  <a:prstGeom prst="rect">
+                    <a:avLst/>
+                  </a:prstGeom>
+                </pic:spPr>
+              </pic:pic>
+            </a:graphicData>
+          </a:graphic>
+        </wp:anchor>
+      </w:drawing>
+    </w:r>
+  </w:p>
   <w:tbl>
     <w:tblPr>
       <w:tblStyle w:val="Tablaconcuadrcula"/>
@@ -1471,6 +1805,58 @@
 
 <file path=word/header3.xml><?xml version="1.0" encoding="utf-8"?>
 <w:hdr xmlns:wpc="http://schemas.microsoft.com/office/word/2010/wordprocessingCanvas" xmlns:cx="http://schemas.microsoft.com/office/drawing/2014/chartex" xmlns:cx1="http://schemas.microsoft.com/office/drawing/2015/9/8/chartex" xmlns:cx2="http://schemas.microsoft.com/office/drawing/2015/10/21/chartex" xmlns:cx3="http://schemas.microsoft.com/office/drawing/2016/5/9/chartex" xmlns:cx4="http://schemas.microsoft.com/office/drawing/2016/5/10/chartex" xmlns:cx5="http://schemas.microsoft.com/office/drawing/2016/5/11/chartex" xmlns:cx6="http://schemas.microsoft.com/office/drawing/2016/5/12/chartex" xmlns:cx7="http://schemas.microsoft.com/office/drawing/2016/5/13/chartex" xmlns:cx8="http://schemas.microsoft.com/office/drawing/2016/5/14/chartex" xmlns:mc="http://schemas.openxmlformats.org/markup-compatibility/2006" xmlns:aink="http://schemas.microsoft.com/office/drawing/2016/ink" xmlns:am3d="http://schemas.microsoft.com/office/drawing/2017/model3d" xmlns:o="urn:schemas-microsoft-com:office:office" xmlns:oel="http://schemas.microsoft.com/office/2019/extlst" xmlns:r="http://schemas.openxmlformats.org/officeDocument/2006/relationships" xmlns:m="http://schemas.openxmlformats.org/officeDocument/2006/math" xmlns:v="urn:schemas-microsoft-com:vml" xmlns:wp14="http://schemas.microsoft.com/office/word/2010/wordprocessingDrawing" xmlns:wp="http://schemas.openxmlformats.org/drawingml/2006/wordprocessingDrawing" xmlns:w10="urn:schemas-microsoft-com:office:word" xmlns:w="http://schemas.openxmlformats.org/wordprocessingml/2006/main" xmlns:w14="http://schemas.microsoft.com/office/word/2010/wordml" xmlns:w15="http://schemas.microsoft.com/office/word/2012/wordml" xmlns:w16cex="http://schemas.microsoft.com/office/word/2018/wordml/cex" xmlns:w16cid="http://schemas.microsoft.com/office/word/2016/wordml/cid" xmlns:w16="http://schemas.microsoft.com/office/word/2018/wordml" xmlns:w16du="http://schemas.microsoft.com/office/word/2023/wordml/word16du" xmlns:w16sdtdh="http://schemas.microsoft.com/office/word/2020/wordml/sdtdatahash" xmlns:w16sdtfl="http://schemas.microsoft.com/office/word/2024/wordml/sdtformatlock" xmlns:w16se="http://schemas.microsoft.com/office/word/2015/wordml/symex" xmlns:wpg="http://schemas.microsoft.com/office/word/2010/wordprocessingGroup" xmlns:wpi="http://schemas.microsoft.com/office/word/2010/wordprocessingInk" xmlns:wne="http://schemas.microsoft.com/office/word/2006/wordml" xmlns:wps="http://schemas.microsoft.com/office/word/2010/wordprocessingShape" mc:Ignorable="w14 w15 w16se w16cid w16 w16cex w16sdtdh w16sdtfl w16du wp14">
+  <w:p>
+    <w:pPr>
+      <w:pStyle w:val="Encabezado"/>
+      <w:spacing w:after="0"/>
+    </w:pPr>
+    <w:r>
+      <w:rPr>
+        <w:noProof/>
+      </w:rPr>
+      <w:drawing>
+        <wp:anchor xmlns:wp="http://schemas.openxmlformats.org/drawingml/2006/wordprocessingDrawing" distT="0" distB="0" distL="0" distR="0" simplePos="0" relativeHeight="1" behindDoc="1" locked="0" layoutInCell="1" allowOverlap="1">
+          <wp:simplePos x="0" y="0"/>
+          <wp:positionH relativeFrom="page">
+            <wp:align>center</wp:align>
+          </wp:positionH>
+          <wp:positionV relativeFrom="page">
+            <wp:align>center</wp:align>
+          </wp:positionV>
+          <wp:extent cx="4500000" cy="2085577"/>
+          <wp:effectExtent l="0" t="0" r="0" b="0"/>
+          <wp:wrapNone/>
+          <wp:docPr id="9101" name="Marca de agua Tecjuridicos"/>
+          <wp:cNvGraphicFramePr/>
+          <a:graphic xmlns:a="http://schemas.openxmlformats.org/drawingml/2006/main">
+            <a:graphicData uri="http://schemas.openxmlformats.org/drawingml/2006/picture">
+              <pic:pic xmlns:pic="http://schemas.openxmlformats.org/drawingml/2006/picture">
+                <pic:nvPicPr>
+                  <pic:cNvPr id="9101" name="marca-de-agua.png"/>
+                  <pic:cNvPicPr/>
+                </pic:nvPicPr>
+                <pic:blipFill>
+                  <a:blip r:embed="rIdMarca"/>
+                  <a:stretch>
+                    <a:fillRect/>
+                  </a:stretch>
+                </pic:blipFill>
+                <pic:spPr>
+                  <a:xfrm>
+                    <a:off x="0" y="0"/>
+                    <a:ext cx="4500000" cy="2085577"/>
+                  </a:xfrm>
+                  <a:prstGeom prst="rect">
+                    <a:avLst/>
+                  </a:prstGeom>
+                </pic:spPr>
+              </pic:pic>
+            </a:graphicData>
+          </a:graphic>
+        </wp:anchor>
+      </w:drawing>
+    </w:r>
+  </w:p>
   <w:tbl>
     <w:tblPr>
       <w:tblStyle w:val="Tablaconcuadrcula"/>

</xml_diff>

<commit_message>
Versión 2.2.4: membrete, pie, numeración de página y marca de agua en todos los PDF y Word que genera la App [azure]
Co-Authored-By: Claude Sonnet 5.5 <noreply@anthropic.com>
Claude-Session: https://claude.ai/code/session_018NctcCo68KjpMsUcXQk7bM
</commit_message>
<xml_diff>
--- a/juanmaapp/public/recibo-base.docx
+++ b/juanmaapp/public/recibo-base.docx
@@ -448,11 +448,11 @@
       </w:r>
     </w:p>
     <w:sectPr>
-      <w:headerReference w:type="even" r:id="rId9"/>
-      <w:headerReference w:type="default" r:id="rId10"/>
-      <w:footerReference w:type="default" r:id="rId11"/>
-      <w:headerReference w:type="first" r:id="rId12"/>
-      <w:footerReference w:type="first" r:id="rId13"/>
+      <w:headerReference w:type="even" r:id="rId8"/>
+      <w:headerReference w:type="default" r:id="rId9"/>
+      <w:footerReference w:type="default" r:id="rId10"/>
+      <w:headerReference w:type="first" r:id="rId11"/>
+      <w:footerReference w:type="first" r:id="rId12"/>
       <w:pgSz w:w="12240" w:h="15840" w:code="1"/>
       <w:pgMar w:top="1701" w:right="1701" w:bottom="1701" w:left="1985" w:header="709" w:footer="709" w:gutter="0"/>
       <w:pgBorders w:offsetFrom="page">
@@ -843,6 +843,121 @@
       </w:rPr>
     </w:pPr>
   </w:p>
+  <w:p>
+    <w:pPr>
+      <w:pStyle w:val="Piedepgina"/>
+      <w:spacing w:before="60" w:after="0"/>
+      <w:jc w:val="right"/>
+    </w:pPr>
+    <w:r>
+      <w:rPr>
+        <w:rFonts w:ascii="Century Gothic" w:hAnsi="Century Gothic"/>
+        <w:color w:val="1F3864"/>
+        <w:sz w:val="16"/>
+        <w:szCs w:val="16"/>
+      </w:rPr>
+      <w:t xml:space="preserve">Página </w:t>
+    </w:r>
+    <w:r>
+      <w:rPr>
+        <w:rFonts w:ascii="Century Gothic" w:hAnsi="Century Gothic"/>
+        <w:color w:val="1F3864"/>
+        <w:sz w:val="16"/>
+        <w:szCs w:val="16"/>
+      </w:rPr>
+      <w:fldChar w:fldCharType="begin"/>
+    </w:r>
+    <w:r>
+      <w:rPr>
+        <w:rFonts w:ascii="Century Gothic" w:hAnsi="Century Gothic"/>
+        <w:color w:val="1F3864"/>
+        <w:sz w:val="16"/>
+        <w:szCs w:val="16"/>
+      </w:rPr>
+      <w:instrText xml:space="preserve"> PAGE </w:instrText>
+    </w:r>
+    <w:r>
+      <w:rPr>
+        <w:rFonts w:ascii="Century Gothic" w:hAnsi="Century Gothic"/>
+        <w:color w:val="1F3864"/>
+        <w:sz w:val="16"/>
+        <w:szCs w:val="16"/>
+      </w:rPr>
+      <w:fldChar w:fldCharType="separate"/>
+    </w:r>
+    <w:r>
+      <w:rPr>
+        <w:rFonts w:ascii="Century Gothic" w:hAnsi="Century Gothic"/>
+        <w:color w:val="1F3864"/>
+        <w:sz w:val="16"/>
+        <w:szCs w:val="16"/>
+      </w:rPr>
+      <w:t>1</w:t>
+    </w:r>
+    <w:r>
+      <w:rPr>
+        <w:rFonts w:ascii="Century Gothic" w:hAnsi="Century Gothic"/>
+        <w:color w:val="1F3864"/>
+        <w:sz w:val="16"/>
+        <w:szCs w:val="16"/>
+      </w:rPr>
+      <w:fldChar w:fldCharType="end"/>
+    </w:r>
+    <w:r>
+      <w:rPr>
+        <w:rFonts w:ascii="Century Gothic" w:hAnsi="Century Gothic"/>
+        <w:color w:val="1F3864"/>
+        <w:sz w:val="16"/>
+        <w:szCs w:val="16"/>
+      </w:rPr>
+      <w:t xml:space="preserve"> de </w:t>
+    </w:r>
+    <w:r>
+      <w:rPr>
+        <w:rFonts w:ascii="Century Gothic" w:hAnsi="Century Gothic"/>
+        <w:color w:val="1F3864"/>
+        <w:sz w:val="16"/>
+        <w:szCs w:val="16"/>
+      </w:rPr>
+      <w:fldChar w:fldCharType="begin"/>
+    </w:r>
+    <w:r>
+      <w:rPr>
+        <w:rFonts w:ascii="Century Gothic" w:hAnsi="Century Gothic"/>
+        <w:color w:val="1F3864"/>
+        <w:sz w:val="16"/>
+        <w:szCs w:val="16"/>
+      </w:rPr>
+      <w:instrText xml:space="preserve"> NUMPAGES </w:instrText>
+    </w:r>
+    <w:r>
+      <w:rPr>
+        <w:rFonts w:ascii="Century Gothic" w:hAnsi="Century Gothic"/>
+        <w:color w:val="1F3864"/>
+        <w:sz w:val="16"/>
+        <w:szCs w:val="16"/>
+      </w:rPr>
+      <w:fldChar w:fldCharType="separate"/>
+    </w:r>
+    <w:r>
+      <w:rPr>
+        <w:rFonts w:ascii="Century Gothic" w:hAnsi="Century Gothic"/>
+        <w:color w:val="1F3864"/>
+        <w:sz w:val="16"/>
+        <w:szCs w:val="16"/>
+      </w:rPr>
+      <w:t>1</w:t>
+    </w:r>
+    <w:r>
+      <w:rPr>
+        <w:rFonts w:ascii="Century Gothic" w:hAnsi="Century Gothic"/>
+        <w:color w:val="1F3864"/>
+        <w:sz w:val="16"/>
+        <w:szCs w:val="16"/>
+      </w:rPr>
+      <w:fldChar w:fldCharType="end"/>
+    </w:r>
+  </w:p>
 </w:ftr>
 </file>
 
@@ -1228,6 +1343,121 @@
       </w:rPr>
     </w:pPr>
   </w:p>
+  <w:p>
+    <w:pPr>
+      <w:pStyle w:val="Piedepgina"/>
+      <w:spacing w:before="60" w:after="0"/>
+      <w:jc w:val="right"/>
+    </w:pPr>
+    <w:r>
+      <w:rPr>
+        <w:rFonts w:ascii="Century Gothic" w:hAnsi="Century Gothic"/>
+        <w:color w:val="1F3864"/>
+        <w:sz w:val="16"/>
+        <w:szCs w:val="16"/>
+      </w:rPr>
+      <w:t xml:space="preserve">Página </w:t>
+    </w:r>
+    <w:r>
+      <w:rPr>
+        <w:rFonts w:ascii="Century Gothic" w:hAnsi="Century Gothic"/>
+        <w:color w:val="1F3864"/>
+        <w:sz w:val="16"/>
+        <w:szCs w:val="16"/>
+      </w:rPr>
+      <w:fldChar w:fldCharType="begin"/>
+    </w:r>
+    <w:r>
+      <w:rPr>
+        <w:rFonts w:ascii="Century Gothic" w:hAnsi="Century Gothic"/>
+        <w:color w:val="1F3864"/>
+        <w:sz w:val="16"/>
+        <w:szCs w:val="16"/>
+      </w:rPr>
+      <w:instrText xml:space="preserve"> PAGE </w:instrText>
+    </w:r>
+    <w:r>
+      <w:rPr>
+        <w:rFonts w:ascii="Century Gothic" w:hAnsi="Century Gothic"/>
+        <w:color w:val="1F3864"/>
+        <w:sz w:val="16"/>
+        <w:szCs w:val="16"/>
+      </w:rPr>
+      <w:fldChar w:fldCharType="separate"/>
+    </w:r>
+    <w:r>
+      <w:rPr>
+        <w:rFonts w:ascii="Century Gothic" w:hAnsi="Century Gothic"/>
+        <w:color w:val="1F3864"/>
+        <w:sz w:val="16"/>
+        <w:szCs w:val="16"/>
+      </w:rPr>
+      <w:t>1</w:t>
+    </w:r>
+    <w:r>
+      <w:rPr>
+        <w:rFonts w:ascii="Century Gothic" w:hAnsi="Century Gothic"/>
+        <w:color w:val="1F3864"/>
+        <w:sz w:val="16"/>
+        <w:szCs w:val="16"/>
+      </w:rPr>
+      <w:fldChar w:fldCharType="end"/>
+    </w:r>
+    <w:r>
+      <w:rPr>
+        <w:rFonts w:ascii="Century Gothic" w:hAnsi="Century Gothic"/>
+        <w:color w:val="1F3864"/>
+        <w:sz w:val="16"/>
+        <w:szCs w:val="16"/>
+      </w:rPr>
+      <w:t xml:space="preserve"> de </w:t>
+    </w:r>
+    <w:r>
+      <w:rPr>
+        <w:rFonts w:ascii="Century Gothic" w:hAnsi="Century Gothic"/>
+        <w:color w:val="1F3864"/>
+        <w:sz w:val="16"/>
+        <w:szCs w:val="16"/>
+      </w:rPr>
+      <w:fldChar w:fldCharType="begin"/>
+    </w:r>
+    <w:r>
+      <w:rPr>
+        <w:rFonts w:ascii="Century Gothic" w:hAnsi="Century Gothic"/>
+        <w:color w:val="1F3864"/>
+        <w:sz w:val="16"/>
+        <w:szCs w:val="16"/>
+      </w:rPr>
+      <w:instrText xml:space="preserve"> NUMPAGES </w:instrText>
+    </w:r>
+    <w:r>
+      <w:rPr>
+        <w:rFonts w:ascii="Century Gothic" w:hAnsi="Century Gothic"/>
+        <w:color w:val="1F3864"/>
+        <w:sz w:val="16"/>
+        <w:szCs w:val="16"/>
+      </w:rPr>
+      <w:fldChar w:fldCharType="separate"/>
+    </w:r>
+    <w:r>
+      <w:rPr>
+        <w:rFonts w:ascii="Century Gothic" w:hAnsi="Century Gothic"/>
+        <w:color w:val="1F3864"/>
+        <w:sz w:val="16"/>
+        <w:szCs w:val="16"/>
+      </w:rPr>
+      <w:t>1</w:t>
+    </w:r>
+    <w:r>
+      <w:rPr>
+        <w:rFonts w:ascii="Century Gothic" w:hAnsi="Century Gothic"/>
+        <w:color w:val="1F3864"/>
+        <w:sz w:val="16"/>
+        <w:szCs w:val="16"/>
+      </w:rPr>
+      <w:fldChar w:fldCharType="end"/>
+    </w:r>
+  </w:p>
 </w:ftr>
 </file>
 
@@ -1262,6 +1492,58 @@
   <w:p>
     <w:pPr>
       <w:pStyle w:val="Encabezado"/>
+      <w:spacing w:after="0"/>
+    </w:pPr>
+    <w:r>
+      <w:rPr>
+        <w:noProof/>
+      </w:rPr>
+      <w:drawing>
+        <wp:anchor xmlns:wp="http://schemas.openxmlformats.org/drawingml/2006/wordprocessingDrawing" distT="0" distB="0" distL="0" distR="0" simplePos="0" relativeHeight="1" behindDoc="1" locked="0" layoutInCell="1" allowOverlap="1">
+          <wp:simplePos x="0" y="0"/>
+          <wp:positionH relativeFrom="page">
+            <wp:align>center</wp:align>
+          </wp:positionH>
+          <wp:positionV relativeFrom="page">
+            <wp:align>center</wp:align>
+          </wp:positionV>
+          <wp:extent cx="4500000" cy="2085577"/>
+          <wp:effectExtent l="0" t="0" r="0" b="0"/>
+          <wp:wrapNone/>
+          <wp:docPr id="9101" name="Marca de agua Tecjuridicos"/>
+          <wp:cNvGraphicFramePr/>
+          <a:graphic xmlns:a="http://schemas.openxmlformats.org/drawingml/2006/main">
+            <a:graphicData uri="http://schemas.openxmlformats.org/drawingml/2006/picture">
+              <pic:pic xmlns:pic="http://schemas.openxmlformats.org/drawingml/2006/picture">
+                <pic:nvPicPr>
+                  <pic:cNvPr id="9101" name="marca-de-agua.png"/>
+                  <pic:cNvPicPr/>
+                </pic:nvPicPr>
+                <pic:blipFill>
+                  <a:blip r:embed="rIdMarca"/>
+                  <a:stretch>
+                    <a:fillRect/>
+                  </a:stretch>
+                </pic:blipFill>
+                <pic:spPr>
+                  <a:xfrm>
+                    <a:off x="0" y="0"/>
+                    <a:ext cx="4500000" cy="2085577"/>
+                  </a:xfrm>
+                  <a:prstGeom prst="rect">
+                    <a:avLst/>
+                  </a:prstGeom>
+                </pic:spPr>
+              </pic:pic>
+            </a:graphicData>
+          </a:graphic>
+        </wp:anchor>
+      </w:drawing>
+    </w:r>
+  </w:p>
+  <w:p>
+    <w:pPr>
+      <w:pStyle w:val="Encabezado"/>
       <w:framePr w:wrap="around" w:vAnchor="text" w:hAnchor="margin" w:xAlign="center" w:y="1"/>
       <w:rPr>
         <w:rStyle w:val="Nmerodepgina"/>
@@ -1309,6 +1591,58 @@
 
 <file path=word/header2.xml><?xml version="1.0" encoding="utf-8"?>
 <w:hdr xmlns:wpc="http://schemas.microsoft.com/office/word/2010/wordprocessingCanvas" xmlns:cx="http://schemas.microsoft.com/office/drawing/2014/chartex" xmlns:cx1="http://schemas.microsoft.com/office/drawing/2015/9/8/chartex" xmlns:cx2="http://schemas.microsoft.com/office/drawing/2015/10/21/chartex" xmlns:cx3="http://schemas.microsoft.com/office/drawing/2016/5/9/chartex" xmlns:cx4="http://schemas.microsoft.com/office/drawing/2016/5/10/chartex" xmlns:cx5="http://schemas.microsoft.com/office/drawing/2016/5/11/chartex" xmlns:cx6="http://schemas.microsoft.com/office/drawing/2016/5/12/chartex" xmlns:cx7="http://schemas.microsoft.com/office/drawing/2016/5/13/chartex" xmlns:cx8="http://schemas.microsoft.com/office/drawing/2016/5/14/chartex" xmlns:mc="http://schemas.openxmlformats.org/markup-compatibility/2006" xmlns:aink="http://schemas.microsoft.com/office/drawing/2016/ink" xmlns:am3d="http://schemas.microsoft.com/office/drawing/2017/model3d" xmlns:o="urn:schemas-microsoft-com:office:office" xmlns:oel="http://schemas.microsoft.com/office/2019/extlst" xmlns:r="http://schemas.openxmlformats.org/officeDocument/2006/relationships" xmlns:m="http://schemas.openxmlformats.org/officeDocument/2006/math" xmlns:v="urn:schemas-microsoft-com:vml" xmlns:wp14="http://schemas.microsoft.com/office/word/2010/wordprocessingDrawing" xmlns:wp="http://schemas.openxmlformats.org/drawingml/2006/wordprocessingDrawing" xmlns:w10="urn:schemas-microsoft-com:office:word" xmlns:w="http://schemas.openxmlformats.org/wordprocessingml/2006/main" xmlns:w14="http://schemas.microsoft.com/office/word/2010/wordml" xmlns:w15="http://schemas.microsoft.com/office/word/2012/wordml" xmlns:w16cex="http://schemas.microsoft.com/office/word/2018/wordml/cex" xmlns:w16cid="http://schemas.microsoft.com/office/word/2016/wordml/cid" xmlns:w16="http://schemas.microsoft.com/office/word/2018/wordml" xmlns:w16du="http://schemas.microsoft.com/office/word/2023/wordml/word16du" xmlns:w16sdtdh="http://schemas.microsoft.com/office/word/2020/wordml/sdtdatahash" xmlns:w16sdtfl="http://schemas.microsoft.com/office/word/2024/wordml/sdtformatlock" xmlns:w16se="http://schemas.microsoft.com/office/word/2015/wordml/symex" xmlns:wpg="http://schemas.microsoft.com/office/word/2010/wordprocessingGroup" xmlns:wpi="http://schemas.microsoft.com/office/word/2010/wordprocessingInk" xmlns:wne="http://schemas.microsoft.com/office/word/2006/wordml" xmlns:wps="http://schemas.microsoft.com/office/word/2010/wordprocessingShape" mc:Ignorable="w14 w15 w16se w16cid w16 w16cex w16sdtdh w16sdtfl w16du wp14">
+  <w:p>
+    <w:pPr>
+      <w:pStyle w:val="Encabezado"/>
+      <w:spacing w:after="0"/>
+    </w:pPr>
+    <w:r>
+      <w:rPr>
+        <w:noProof/>
+      </w:rPr>
+      <w:drawing>
+        <wp:anchor xmlns:wp="http://schemas.openxmlformats.org/drawingml/2006/wordprocessingDrawing" distT="0" distB="0" distL="0" distR="0" simplePos="0" relativeHeight="1" behindDoc="1" locked="0" layoutInCell="1" allowOverlap="1">
+          <wp:simplePos x="0" y="0"/>
+          <wp:positionH relativeFrom="page">
+            <wp:align>center</wp:align>
+          </wp:positionH>
+          <wp:positionV relativeFrom="page">
+            <wp:align>center</wp:align>
+          </wp:positionV>
+          <wp:extent cx="4500000" cy="2085577"/>
+          <wp:effectExtent l="0" t="0" r="0" b="0"/>
+          <wp:wrapNone/>
+          <wp:docPr id="9101" name="Marca de agua Tecjuridicos"/>
+          <wp:cNvGraphicFramePr/>
+          <a:graphic xmlns:a="http://schemas.openxmlformats.org/drawingml/2006/main">
+            <a:graphicData uri="http://schemas.openxmlformats.org/drawingml/2006/picture">
+              <pic:pic xmlns:pic="http://schemas.openxmlformats.org/drawingml/2006/picture">
+                <pic:nvPicPr>
+                  <pic:cNvPr id="9101" name="marca-de-agua.png"/>
+                  <pic:cNvPicPr/>
+                </pic:nvPicPr>
+                <pic:blipFill>
+                  <a:blip r:embed="rIdMarca"/>
+                  <a:stretch>
+                    <a:fillRect/>
+                  </a:stretch>
+                </pic:blipFill>
+                <pic:spPr>
+                  <a:xfrm>
+                    <a:off x="0" y="0"/>
+                    <a:ext cx="4500000" cy="2085577"/>
+                  </a:xfrm>
+                  <a:prstGeom prst="rect">
+                    <a:avLst/>
+                  </a:prstGeom>
+                </pic:spPr>
+              </pic:pic>
+            </a:graphicData>
+          </a:graphic>
+        </wp:anchor>
+      </w:drawing>
+    </w:r>
+  </w:p>
   <w:tbl>
     <w:tblPr>
       <w:tblStyle w:val="Tablaconcuadrcula"/>
@@ -1471,6 +1805,58 @@
 
 <file path=word/header3.xml><?xml version="1.0" encoding="utf-8"?>
 <w:hdr xmlns:wpc="http://schemas.microsoft.com/office/word/2010/wordprocessingCanvas" xmlns:cx="http://schemas.microsoft.com/office/drawing/2014/chartex" xmlns:cx1="http://schemas.microsoft.com/office/drawing/2015/9/8/chartex" xmlns:cx2="http://schemas.microsoft.com/office/drawing/2015/10/21/chartex" xmlns:cx3="http://schemas.microsoft.com/office/drawing/2016/5/9/chartex" xmlns:cx4="http://schemas.microsoft.com/office/drawing/2016/5/10/chartex" xmlns:cx5="http://schemas.microsoft.com/office/drawing/2016/5/11/chartex" xmlns:cx6="http://schemas.microsoft.com/office/drawing/2016/5/12/chartex" xmlns:cx7="http://schemas.microsoft.com/office/drawing/2016/5/13/chartex" xmlns:cx8="http://schemas.microsoft.com/office/drawing/2016/5/14/chartex" xmlns:mc="http://schemas.openxmlformats.org/markup-compatibility/2006" xmlns:aink="http://schemas.microsoft.com/office/drawing/2016/ink" xmlns:am3d="http://schemas.microsoft.com/office/drawing/2017/model3d" xmlns:o="urn:schemas-microsoft-com:office:office" xmlns:oel="http://schemas.microsoft.com/office/2019/extlst" xmlns:r="http://schemas.openxmlformats.org/officeDocument/2006/relationships" xmlns:m="http://schemas.openxmlformats.org/officeDocument/2006/math" xmlns:v="urn:schemas-microsoft-com:vml" xmlns:wp14="http://schemas.microsoft.com/office/word/2010/wordprocessingDrawing" xmlns:wp="http://schemas.openxmlformats.org/drawingml/2006/wordprocessingDrawing" xmlns:w10="urn:schemas-microsoft-com:office:word" xmlns:w="http://schemas.openxmlformats.org/wordprocessingml/2006/main" xmlns:w14="http://schemas.microsoft.com/office/word/2010/wordml" xmlns:w15="http://schemas.microsoft.com/office/word/2012/wordml" xmlns:w16cex="http://schemas.microsoft.com/office/word/2018/wordml/cex" xmlns:w16cid="http://schemas.microsoft.com/office/word/2016/wordml/cid" xmlns:w16="http://schemas.microsoft.com/office/word/2018/wordml" xmlns:w16du="http://schemas.microsoft.com/office/word/2023/wordml/word16du" xmlns:w16sdtdh="http://schemas.microsoft.com/office/word/2020/wordml/sdtdatahash" xmlns:w16sdtfl="http://schemas.microsoft.com/office/word/2024/wordml/sdtformatlock" xmlns:w16se="http://schemas.microsoft.com/office/word/2015/wordml/symex" xmlns:wpg="http://schemas.microsoft.com/office/word/2010/wordprocessingGroup" xmlns:wpi="http://schemas.microsoft.com/office/word/2010/wordprocessingInk" xmlns:wne="http://schemas.microsoft.com/office/word/2006/wordml" xmlns:wps="http://schemas.microsoft.com/office/word/2010/wordprocessingShape" mc:Ignorable="w14 w15 w16se w16cid w16 w16cex w16sdtdh w16sdtfl w16du wp14">
+  <w:p>
+    <w:pPr>
+      <w:pStyle w:val="Encabezado"/>
+      <w:spacing w:after="0"/>
+    </w:pPr>
+    <w:r>
+      <w:rPr>
+        <w:noProof/>
+      </w:rPr>
+      <w:drawing>
+        <wp:anchor xmlns:wp="http://schemas.openxmlformats.org/drawingml/2006/wordprocessingDrawing" distT="0" distB="0" distL="0" distR="0" simplePos="0" relativeHeight="1" behindDoc="1" locked="0" layoutInCell="1" allowOverlap="1">
+          <wp:simplePos x="0" y="0"/>
+          <wp:positionH relativeFrom="page">
+            <wp:align>center</wp:align>
+          </wp:positionH>
+          <wp:positionV relativeFrom="page">
+            <wp:align>center</wp:align>
+          </wp:positionV>
+          <wp:extent cx="4500000" cy="2085577"/>
+          <wp:effectExtent l="0" t="0" r="0" b="0"/>
+          <wp:wrapNone/>
+          <wp:docPr id="9101" name="Marca de agua Tecjuridicos"/>
+          <wp:cNvGraphicFramePr/>
+          <a:graphic xmlns:a="http://schemas.openxmlformats.org/drawingml/2006/main">
+            <a:graphicData uri="http://schemas.openxmlformats.org/drawingml/2006/picture">
+              <pic:pic xmlns:pic="http://schemas.openxmlformats.org/drawingml/2006/picture">
+                <pic:nvPicPr>
+                  <pic:cNvPr id="9101" name="marca-de-agua.png"/>
+                  <pic:cNvPicPr/>
+                </pic:nvPicPr>
+                <pic:blipFill>
+                  <a:blip r:embed="rIdMarca"/>
+                  <a:stretch>
+                    <a:fillRect/>
+                  </a:stretch>
+                </pic:blipFill>
+                <pic:spPr>
+                  <a:xfrm>
+                    <a:off x="0" y="0"/>
+                    <a:ext cx="4500000" cy="2085577"/>
+                  </a:xfrm>
+                  <a:prstGeom prst="rect">
+                    <a:avLst/>
+                  </a:prstGeom>
+                </pic:spPr>
+              </pic:pic>
+            </a:graphicData>
+          </a:graphic>
+        </wp:anchor>
+      </w:drawing>
+    </w:r>
+  </w:p>
   <w:tbl>
     <w:tblPr>
       <w:tblStyle w:val="Tablaconcuadrcula"/>

</xml_diff>